<commit_message>
chore: update cv link
</commit_message>
<xml_diff>
--- a/frontend/src/assets/Juan-Pablo-Cano-resume-public.docx
+++ b/frontend/src/assets/Juan-Pablo-Cano-resume-public.docx
@@ -1,6 +1,6 @@
 
 <file path=word/document.xml><?xml version="1.0" encoding="utf-8"?>
-<w:document xmlns:wpc="http://schemas.microsoft.com/office/word/2010/wordprocessingCanvas" xmlns:mc="http://schemas.openxmlformats.org/markup-compatibility/2006" xmlns:o="urn:schemas-microsoft-com:office:office" xmlns:r="http://schemas.openxmlformats.org/officeDocument/2006/relationships" xmlns:m="http://schemas.openxmlformats.org/officeDocument/2006/math" xmlns:v="urn:schemas-microsoft-com:vml" xmlns:wp14="http://schemas.microsoft.com/office/word/2010/wordprocessingDrawing" xmlns:wp="http://schemas.openxmlformats.org/drawingml/2006/wordprocessingDrawing" xmlns:w="http://schemas.openxmlformats.org/wordprocessingml/2006/main" xmlns:w14="http://schemas.microsoft.com/office/word/2010/wordml" xmlns:w10="urn:schemas-microsoft-com:office:word" xmlns:w15="http://schemas.microsoft.com/office/word/2012/wordml" xmlns:wpg="http://schemas.microsoft.com/office/word/2010/wordprocessingGroup" xmlns:wpi="http://schemas.microsoft.com/office/word/2010/wordprocessingInk" xmlns:wne="http://schemas.microsoft.com/office/word/2006/wordml" xmlns:wps="http://schemas.microsoft.com/office/word/2010/wordprocessingShape" xmlns:wpsCustomData="http://www.wps.cn/officeDocument/2013/wpsCustomData" mc:Ignorable="w14 w15 wp14">
+<w:document xmlns:wpc="http://schemas.microsoft.com/office/word/2010/wordprocessingCanvas" xmlns:cx="http://schemas.microsoft.com/office/drawing/2014/chartex" xmlns:cx1="http://schemas.microsoft.com/office/drawing/2015/9/8/chartex" xmlns:cx2="http://schemas.microsoft.com/office/drawing/2015/10/21/chartex" xmlns:cx3="http://schemas.microsoft.com/office/drawing/2016/5/9/chartex" xmlns:cx4="http://schemas.microsoft.com/office/drawing/2016/5/10/chartex" xmlns:cx5="http://schemas.microsoft.com/office/drawing/2016/5/11/chartex" xmlns:cx6="http://schemas.microsoft.com/office/drawing/2016/5/12/chartex" xmlns:cx7="http://schemas.microsoft.com/office/drawing/2016/5/13/chartex" xmlns:cx8="http://schemas.microsoft.com/office/drawing/2016/5/14/chartex" xmlns:mc="http://schemas.openxmlformats.org/markup-compatibility/2006" xmlns:o="urn:schemas-microsoft-com:office:office" xmlns:r="http://schemas.openxmlformats.org/officeDocument/2006/relationships" xmlns:m="http://schemas.openxmlformats.org/officeDocument/2006/math" xmlns:v="urn:schemas-microsoft-com:vml" xmlns:wp14="http://schemas.microsoft.com/office/word/2010/wordprocessingDrawing" xmlns:wp="http://schemas.openxmlformats.org/drawingml/2006/wordprocessingDrawing" xmlns:w="http://schemas.openxmlformats.org/wordprocessingml/2006/main" xmlns:w14="http://schemas.microsoft.com/office/word/2010/wordml" xmlns:w10="urn:schemas-microsoft-com:office:word" xmlns:w15="http://schemas.microsoft.com/office/word/2012/wordml" xmlns:wpg="http://schemas.microsoft.com/office/word/2010/wordprocessingGroup" xmlns:wpi="http://schemas.microsoft.com/office/word/2010/wordprocessingInk" xmlns:wne="http://schemas.microsoft.com/office/word/2006/wordml" xmlns:wps="http://schemas.microsoft.com/office/word/2010/wordprocessingShape" xmlns:wpsCustomData="http://www.wps.cn/officeDocument/2013/wpsCustomData" mc:Ignorable="w14 w15 wp14">
   <w:body>
     <w:p>
       <w:pPr>
@@ -27,16 +27,7 @@
           <w:color w:val="555555"/>
           <w:sz w:val="19"/>
         </w:rPr>
-        <w:t>Medellin, Colombia  |  j1.dev8896@gmail.com</w:t>
-      </w:r>
-      <w:bookmarkStart w:id="0" w:name="_GoBack"/>
-      <w:bookmarkEnd w:id="0"/>
-      <w:r>
-        <w:rPr>
-          <w:color w:val="555555"/>
-          <w:sz w:val="19"/>
-        </w:rPr>
-        <w:t xml:space="preserve">  |  https://www.juanpablocano.com  |  https://www.linkedin.com/in/juan-pablo-cano/</w:t>
+        <w:t>Medellin, Colombia  |  j1.dev8896@gmail.com  |  +57 319 496 8738  |  https://www.juanpablocano.com  |  https://www.linkedin.com/in/juan-pablo-cano/</w:t>
       </w:r>
     </w:p>
     <w:p>
@@ -66,7 +57,22 @@
           <w:color w:val="333333"/>
           <w:sz w:val="20"/>
         </w:rPr>
-        <w:t>Application Security Engineer and Backend Engineer with 5+ years of experience building secure backend systems with Node.js, TypeScript, NestJS, AWS, and distributed architectures.</w:t>
+        <w:t xml:space="preserve">Application Security Engineer and Backend Engineer with 5+ years building secure backends in Node.js, TypeScript, </w:t>
+      </w:r>
+      <w:r>
+        <w:rPr>
+          <w:color w:val="333333"/>
+          <w:sz w:val="20"/>
+          <w:lang w:val="en-US"/>
+        </w:rPr>
+        <w:t>Nest.js</w:t>
+      </w:r>
+      <w:r>
+        <w:rPr>
+          <w:color w:val="333333"/>
+          <w:sz w:val="20"/>
+        </w:rPr>
+        <w:t>, and AWS.</w:t>
       </w:r>
     </w:p>
     <w:p>
@@ -82,7 +88,7 @@
           <w:color w:val="333333"/>
           <w:sz w:val="20"/>
         </w:rPr>
-        <w:t>Experience across B2B SaaS, healthtech, insurtech, and digital wallet products, with a practical focus on vulnerability remediation, production APIs, event-driven services, testing, and cross-team collaboration.</w:t>
+        <w:t>Work spans B2B SaaS, healthtech, insurtech, and digital wallet products, with a focus on fixing vulnerabilities, shipping production APIs, event-driven services, testing, and working across teams.</w:t>
       </w:r>
     </w:p>
     <w:p>
@@ -94,7 +100,7 @@
           <w:color w:val="333333"/>
           <w:sz w:val="20"/>
         </w:rPr>
-        <w:t>Open to relocation to Germany, with full readiness to manage the process independently.</w:t>
+        <w:t>Open to relocating to Germany and managing the process independently.</w:t>
       </w:r>
     </w:p>
     <w:p>
@@ -154,7 +160,24 @@
           <w:rFonts w:hint="default"/>
           <w:lang w:val="en-US"/>
         </w:rPr>
-        <w:t>Remediate security findings across Node.js, Go, Python, and Ember.js codebases, owning fixes from investigation through PR review, merge, and validation.</w:t>
+        <w:t xml:space="preserve">Fix security findings in Node.js </w:t>
+      </w:r>
+      <w:r>
+        <w:rPr>
+          <w:rFonts w:hint="default"/>
+          <w:b w:val="0"/>
+          <w:color w:val="333333"/>
+          <w:sz w:val="20"/>
+          <w:lang w:val="en-US"/>
+        </w:rPr>
+        <w:t>(Nest.js, Hapi.js, Hono.js)</w:t>
+      </w:r>
+      <w:r>
+        <w:rPr>
+          <w:rFonts w:hint="default"/>
+          <w:lang w:val="en-US"/>
+        </w:rPr>
+        <w:t>, Go, Python, and Ember.js codebases: investigate issues, patch them, review PRs, merge, and validate.</w:t>
       </w:r>
     </w:p>
     <w:p>
@@ -168,7 +191,7 @@
           <w:rFonts w:hint="default"/>
           <w:lang w:val="en-US"/>
         </w:rPr>
-        <w:t>Resolved and supported remediation for 25–50 vulnerabilities, including Broken Access Control issues, IDOR, XSS, injection risks, dependency CVEs, and insecure application flows.</w:t>
+        <w:t>Resolve Broken Access Control, IDOR, XSS, injection, dependency CVE, and insecure-flow issues (about 25–50 so far).</w:t>
       </w:r>
     </w:p>
     <w:p>
@@ -182,7 +205,7 @@
           <w:rFonts w:hint="default"/>
           <w:lang w:val="en-US"/>
         </w:rPr>
-        <w:t>Perform security-focused code reviews and Burp Suite testing, translating findings into practical guidance, safer coding patterns, and remediation steps for multiple teams and production applications.</w:t>
+        <w:t>Run security-focused code reviews and Burp Suite tests, then turn findings into clear guidance and safer coding patterns for several teams.</w:t>
       </w:r>
     </w:p>
     <w:p>
@@ -196,7 +219,7 @@
           <w:rFonts w:hint="default"/>
           <w:lang w:val="en-US"/>
         </w:rPr>
-        <w:t>Partner with product engineers to prioritize remediation work by risk and business impact, keeping security fixes clear, testable, and aligned with release timelines.</w:t>
+        <w:t>Work with product engineers to prioritize fixes by risk and business impact, so security changes stay testable and on schedule for release.</w:t>
       </w:r>
     </w:p>
     <w:p>
@@ -210,7 +233,7 @@
           <w:rFonts w:hint="default"/>
           <w:lang w:val="en-US"/>
         </w:rPr>
-        <w:t>Document recurring vulnerability patterns and review feedback to help teams prevent similar issues in future changes.</w:t>
+        <w:t>Document recurring vulnerability patterns and review feedback so teams are less likely to repeat the same mistakes.</w:t>
       </w:r>
     </w:p>
     <w:p>
@@ -256,7 +279,7 @@
           <w:rFonts w:hint="default"/>
           <w:lang w:val="en-US"/>
         </w:rPr>
-        <w:t>Owned React and Node.js (NestJS) features for user and team management workflows, from technical design and API contracts to testing, documentation, stakeholder review, and deployment.</w:t>
+        <w:t>Built React and Nest.js features for user and team management, from API design and tests through documentation, stakeholder review, and deployment.</w:t>
       </w:r>
     </w:p>
     <w:p>
@@ -270,7 +293,7 @@
           <w:rFonts w:hint="default"/>
           <w:lang w:val="en-US"/>
         </w:rPr>
-        <w:t>Architected an AWS SQS/S3 asynchronous workflow for bulk operations, reducing timeout errors by 90% and scaling batch jobs to millions of records.</w:t>
+        <w:t>Built an AWS SQS/S3 async workflow for bulk operations that cut timeout errors by 90% and ran batch jobs across millions of records.</w:t>
       </w:r>
     </w:p>
     <w:p>
@@ -284,7 +307,7 @@
           <w:rFonts w:hint="default"/>
           <w:lang w:val="en-US"/>
         </w:rPr>
-        <w:t>Led code reviews, documentation, and mentoring for junior developers, improving consistency and delivery quality across shared services.</w:t>
+        <w:t>Led code reviews and mentored junior developers, which kept shared services more consistent.</w:t>
       </w:r>
     </w:p>
     <w:p>
@@ -298,7 +321,7 @@
           <w:rFonts w:hint="default"/>
           <w:lang w:val="en-US"/>
         </w:rPr>
-        <w:t>Documented the async processing design and tradeoffs, helping the team understand when to use queues, retries, and audit-friendly storage for large operations.</w:t>
+        <w:t>Documented when to use async bulk flows, including queues, retries, and S3 storage for audits.</w:t>
       </w:r>
     </w:p>
     <w:p>
@@ -312,7 +335,7 @@
           <w:rFonts w:hint="default"/>
           <w:lang w:val="en-US"/>
         </w:rPr>
-        <w:t>Collaborated with product, QA, and backend engineers to validate edge cases around bulk processing, permissions, and operational recovery.</w:t>
+        <w:t>Worked with product, QA, and backend engineers on edge cases around bulk processing, permissions, and recovery.</w:t>
       </w:r>
     </w:p>
     <w:p>
@@ -358,7 +381,7 @@
           <w:rFonts w:hint="default"/>
           <w:lang w:val="en-US"/>
         </w:rPr>
-        <w:t>Built event-driven backend workflows with AWS SQS and S3, improving reliability by 40%, reducing coupling between services, and creating audit trails for compliance-sensitive operations.</w:t>
+        <w:t>Built event-driven workflows with AWS SQS and S3 that improved reliability by 40%, loosened coupling between services, and left audit trails for compliance-sensitive work.</w:t>
       </w:r>
     </w:p>
     <w:p>
@@ -372,7 +395,7 @@
           <w:rFonts w:hint="default"/>
           <w:lang w:val="en-US"/>
         </w:rPr>
-        <w:t>Raised coverage in a critical Kotlin microservice from 65% to 90%, helping reduce production incidents by 30%.</w:t>
+        <w:t>Raised test coverage in a critical Kotlin microservice from 65% to 90%, which helped cut production incidents by 30%.</w:t>
       </w:r>
     </w:p>
     <w:p>
@@ -400,7 +423,7 @@
           <w:rFonts w:hint="default"/>
           <w:lang w:val="en-US"/>
         </w:rPr>
-        <w:t>Delivered React administration features and backend-aligned UI flows for messaging, user management, and internal operations with unit test coverage.</w:t>
+        <w:t>Delivered React admin features for messaging, user management, and internal operations, with unit tests and UI flows tied to the backend.</w:t>
       </w:r>
     </w:p>
     <w:p>
@@ -414,7 +437,7 @@
           <w:rFonts w:hint="default"/>
           <w:lang w:val="en-US"/>
         </w:rPr>
-        <w:t>Worked across backend, frontend, and DevOps concerns to troubleshoot releases, improve deployment confidence, and keep services stable.</w:t>
+        <w:t>Troubleshot releases across backend, frontend, and DevOps so deployments were safer and services stayed stable.</w:t>
       </w:r>
     </w:p>
     <w:p>
@@ -460,7 +483,7 @@
           <w:rFonts w:hint="default"/>
           <w:lang w:val="en-US"/>
         </w:rPr>
-        <w:t>Built Node.js (NestJS) / SpringBoot APIs and microservices for healthtech, insurtech, and digital wallet products, supporting production-critical, customer-facing flows.</w:t>
+        <w:t>Built Nest.js and Spring Boot APIs for healthtech, insurtech, and digital wallet products that served production customer flows.</w:t>
       </w:r>
     </w:p>
     <w:p>
@@ -474,7 +497,7 @@
           <w:rFonts w:hint="default"/>
           <w:lang w:val="en-US"/>
         </w:rPr>
-        <w:t>Designed Kafka-based services with PostgreSQL and Redis, improving targeted backend performance by an estimated 20–40% and reducing recurring issues by 20–30%.</w:t>
+        <w:t>Designed Kafka services with PostgreSQL and Redis that improved targeted backend performance by about 20–40% and cut recurring issues by 20–30%.</w:t>
       </w:r>
     </w:p>
     <w:p>
@@ -488,7 +511,7 @@
           <w:rFonts w:hint="default"/>
           <w:lang w:val="en-US"/>
         </w:rPr>
-        <w:t>Led feature design, code reviews, and reusable engineering patterns across client teams, improving delivery speed by an estimated 20–30% for similar work.</w:t>
+        <w:t>Led feature design and code reviews and shared reusable patterns across client teams, which sped up similar work by about 20–30%.</w:t>
       </w:r>
     </w:p>
     <w:p>
@@ -653,7 +676,26 @@
           <w:color w:val="1A1A1A"/>
           <w:sz w:val="20"/>
         </w:rPr>
-        <w:t>Node.js, TypeScript, NestJS, Application Security, secure code review, vulnerability remediation, Burp Suite</w:t>
+        <w:t xml:space="preserve">Node.js, TypeScript, </w:t>
+      </w:r>
+      <w:r>
+        <w:rPr>
+          <w:b w:val="0"/>
+          <w:bCs/>
+          <w:color w:val="1A1A1A"/>
+          <w:sz w:val="20"/>
+          <w:lang w:val="en-US"/>
+        </w:rPr>
+        <w:t>Nest.js</w:t>
+      </w:r>
+      <w:r>
+        <w:rPr>
+          <w:b w:val="0"/>
+          <w:bCs/>
+          <w:color w:val="1A1A1A"/>
+          <w:sz w:val="20"/>
+        </w:rPr>
+        <w:t xml:space="preserve">, Application Security, </w:t>
       </w:r>
       <w:r>
         <w:rPr>
@@ -664,7 +706,67 @@
           <w:sz w:val="20"/>
           <w:lang w:val="en-US"/>
         </w:rPr>
-        <w:t>, Bugcrowd</w:t>
+        <w:t>S</w:t>
+      </w:r>
+      <w:r>
+        <w:rPr>
+          <w:b w:val="0"/>
+          <w:bCs/>
+          <w:color w:val="1A1A1A"/>
+          <w:sz w:val="20"/>
+        </w:rPr>
+        <w:t xml:space="preserve">ecure </w:t>
+      </w:r>
+      <w:r>
+        <w:rPr>
+          <w:rFonts w:hint="default"/>
+          <w:b w:val="0"/>
+          <w:bCs/>
+          <w:color w:val="1A1A1A"/>
+          <w:sz w:val="20"/>
+          <w:lang w:val="en-US"/>
+        </w:rPr>
+        <w:t>C</w:t>
+      </w:r>
+      <w:r>
+        <w:rPr>
+          <w:b w:val="0"/>
+          <w:bCs/>
+          <w:color w:val="1A1A1A"/>
+          <w:sz w:val="20"/>
+        </w:rPr>
+        <w:t xml:space="preserve">ode </w:t>
+      </w:r>
+      <w:r>
+        <w:rPr>
+          <w:rFonts w:hint="default"/>
+          <w:b w:val="0"/>
+          <w:bCs/>
+          <w:color w:val="1A1A1A"/>
+          <w:sz w:val="20"/>
+          <w:lang w:val="en-US"/>
+        </w:rPr>
+        <w:t>R</w:t>
+      </w:r>
+      <w:r>
+        <w:rPr>
+          <w:b w:val="0"/>
+          <w:bCs/>
+          <w:color w:val="1A1A1A"/>
+          <w:sz w:val="20"/>
+        </w:rPr>
+        <w:t xml:space="preserve">eview, </w:t>
+      </w:r>
+      <w:r>
+        <w:rPr>
+          <w:rFonts w:hint="default"/>
+          <w:b w:val="0"/>
+          <w:bCs/>
+          <w:color w:val="1A1A1A"/>
+          <w:sz w:val="20"/>
+          <w:lang w:val="en-US"/>
+        </w:rPr>
+        <w:t>Vulnerability Management</w:t>
       </w:r>
     </w:p>
     <w:p>
@@ -782,10 +884,29 @@
         </w:rPr>
         <w:t xml:space="preserve"> Jest, Jasmine, unit/integration testing, TDD, CI quality gates</w:t>
       </w:r>
+      <w:r>
+        <w:rPr>
+          <w:rFonts w:hint="default"/>
+          <w:b w:val="0"/>
+          <w:bCs/>
+          <w:color w:val="1A1A1A"/>
+          <w:sz w:val="20"/>
+          <w:lang w:val="en-US"/>
+        </w:rPr>
+        <w:t>, Vitest, Oxlint, Burp Suite, Postman, Grafana, Datadog, Splunk</w:t>
+      </w:r>
     </w:p>
     <w:p>
       <w:pPr>
         <w:spacing w:before="40" w:after="20"/>
+        <w:rPr>
+          <w:rFonts w:hint="default"/>
+          <w:b w:val="0"/>
+          <w:bCs/>
+          <w:color w:val="1A1A1A"/>
+          <w:sz w:val="20"/>
+          <w:lang w:val="en-US"/>
+        </w:rPr>
       </w:pPr>
       <w:r>
         <w:rPr>
@@ -803,6 +924,54 @@
           <w:sz w:val="20"/>
         </w:rPr>
         <w:t>Git, Jira, Agile/Scrum, technical documentation, code reviews</w:t>
+      </w:r>
+      <w:r>
+        <w:rPr>
+          <w:rFonts w:hint="default"/>
+          <w:b w:val="0"/>
+          <w:bCs/>
+          <w:color w:val="1A1A1A"/>
+          <w:sz w:val="20"/>
+          <w:lang w:val="en-US"/>
+        </w:rPr>
+        <w:t>, Superhuman Docs (Coda), OWASP Top 10</w:t>
+      </w:r>
+      <w:bookmarkStart w:id="0" w:name="_GoBack"/>
+      <w:bookmarkEnd w:id="0"/>
+    </w:p>
+    <w:p>
+      <w:pPr>
+        <w:spacing w:before="40" w:after="20"/>
+        <w:rPr>
+          <w:rFonts w:hint="default"/>
+          <w:b w:val="0"/>
+          <w:bCs/>
+          <w:color w:val="1A1A1A"/>
+          <w:sz w:val="20"/>
+          <w:lang w:val="en-US"/>
+        </w:rPr>
+      </w:pPr>
+      <w:r>
+        <w:rPr>
+          <w:rFonts w:hint="default"/>
+          <w:b/>
+          <w:bCs w:val="0"/>
+          <w:color w:val="1A1A1A"/>
+          <w:sz w:val="20"/>
+          <w:lang w:val="en-US"/>
+        </w:rPr>
+        <w:t xml:space="preserve">AI Tools: </w:t>
+      </w:r>
+      <w:r>
+        <w:rPr>
+          <w:rFonts w:hint="default"/>
+          <w:b w:val="0"/>
+          <w:bCs/>
+          <w:color w:val="1A1A1A"/>
+          <w:sz w:val="20"/>
+          <w:lang w:val="en-US"/>
+        </w:rPr>
+        <w:t>Claude Code, Unblocked, Gemini, Codex, Cursor</w:t>
       </w:r>
     </w:p>
     <w:p>
@@ -14085,7 +14254,7 @@
 </file>
 
 <file path=customXml/item1.xml><?xml version="1.0" encoding="utf-8"?>
-<b:Sources xmlns="http://schemas.openxmlformats.org/officeDocument/2006/bibliography" xmlns:b="http://schemas.openxmlformats.org/officeDocument/2006/bibliography" StyleName="APA" SelectedStyle="/APA.XSL"/>
+<b:Sources xmlns:b="http://schemas.openxmlformats.org/officeDocument/2006/bibliography" xmlns="http://schemas.openxmlformats.org/officeDocument/2006/bibliography" StyleName="APA" SelectedStyle="/APA.XSL"/>
 </file>
 
 <file path=customXml/itemProps1.xml><?xml version="1.0" encoding="utf-8"?>

</xml_diff>